<commit_message>
WIP: themed gradient/pattern fill resolution (incomplete, killed by a full disk)
Preserved verbatim so the work is not lost. NOT verified: the agent was stopped
mid-run when the disk filled, so no gate completed against it and no mutation proof
exists yet. It also touches casual-doc-model v1 model types (body.rs, properties.rs)
and regenerates fixtures/generated/themed-shape.docx plus the manifest, so it carries
the SKILL 5a combination hazard and needs a full --all-targets check before it is
trusted. Treat every claim in it as unverified until re-run.
</commit_message>
<xml_diff>
--- a/fixtures/generated/themed-shape.docx
+++ b/fixtures/generated/themed-shape.docx
@@ -86,7 +86,7 @@
                     <a:fillRef idx="2">
                       <a:schemeClr val="accent1"/>
                     </a:fillRef>
-                    <a:effectRef idx="0">
+                    <a:effectRef idx="1">
                       <a:schemeClr val="accent1"/>
                     </a:effectRef>
                     <a:fontRef idx="minor">
@@ -130,11 +130,58 @@
                     <a:lnRef idx="1">
                       <a:schemeClr val="accent3"/>
                     </a:lnRef>
-                    <a:fillRef idx="3">
+                    <a:fillRef idx="4">
                       <a:schemeClr val="accent3"/>
                     </a:fillRef>
                     <a:effectRef idx="0">
                       <a:schemeClr val="accent3"/>
+                    </a:effectRef>
+                    <a:fontRef idx="minor">
+                      <a:schemeClr val="lt1"/>
+                    </a:fontRef>
+                  </wps:style>
+                  <wps:bodyPr/>
+                </wps:wsp>
+              </a:graphicData>
+            </a:graphic>
+          </wp:anchor>
+        </w:drawing>
+      </w:r>
+      <w:r>
+        <w:drawing>
+          <wp:anchor behindDoc="0" relativeHeight="13" simplePos="0">
+            <wp:simplePos x="0" y="0"/>
+            <wp:positionH relativeFrom="page">
+              <wp:posOffset>914400</wp:posOffset>
+            </wp:positionH>
+            <wp:positionV relativeFrom="page">
+              <wp:posOffset>2743200</wp:posOffset>
+            </wp:positionV>
+            <wp:extent cx="914400" cy="914400"/>
+            <wp:wrapNone/>
+            <wp:docPr id="7" name="Pattern styled"/>
+            <a:graphic>
+              <a:graphicData uri="http://schemas.microsoft.com/office/word/2010/wordprocessingShape">
+                <wps:wsp>
+                  <wps:cNvPr id="8" name="Shape 4"/>
+                  <wps:spPr>
+                    <a:xfrm>
+                      <a:off x="0" y="0"/>
+                      <a:ext cx="914400" cy="914400"/>
+                    </a:xfrm>
+                    <a:prstGeom prst="rect">
+                      <a:avLst/>
+                    </a:prstGeom>
+                  </wps:spPr>
+                  <wps:style>
+                    <a:lnRef idx="1">
+                      <a:schemeClr val="accent4"/>
+                    </a:lnRef>
+                    <a:fillRef idx="3">
+                      <a:schemeClr val="accent4"/>
+                    </a:fillRef>
+                    <a:effectRef idx="2">
+                      <a:schemeClr val="accent4"/>
                     </a:effectRef>
                     <a:fontRef idx="minor">
                       <a:schemeClr val="lt1"/>
@@ -213,14 +260,24 @@
         <a:gradFill rotWithShape="1">
           <a:gsLst>
             <a:gs pos="0">
-              <a:schemeClr val="phClr"/>
+              <a:schemeClr val="phClr">
+                <a:tint val="40000"/>
+              </a:schemeClr>
             </a:gs>
             <a:gs pos="100000">
-              <a:schemeClr val="phClr"/>
+              <a:srgbClr val="0000FF"/>
             </a:gs>
           </a:gsLst>
           <a:lin ang="5400000" scaled="0"/>
         </a:gradFill>
+        <a:pattFill prst="pct25">
+          <a:fgClr>
+            <a:schemeClr val="phClr"/>
+          </a:fgClr>
+          <a:bgClr>
+            <a:srgbClr val="FFFFFF"/>
+          </a:bgClr>
+        </a:pattFill>
         <a:solidFill>
           <a:srgbClr val="C0FFEE"/>
         </a:solidFill>
@@ -234,13 +291,30 @@
         </a:ln>
         <a:ln w="12700">
           <a:gradFill>
-            <a:gsLst/>
+            <a:gsLst>
+              <a:gs pos="0">
+                <a:schemeClr val="phClr"/>
+              </a:gs>
+              <a:gs pos="100000">
+                <a:srgbClr val="808080"/>
+              </a:gs>
+            </a:gsLst>
+            <a:lin ang="0" scaled="0"/>
           </a:gradFill>
         </a:ln>
       </a:lnStyleLst>
       <a:effectStyleLst>
         <a:effectStyle>
           <a:effectLst/>
+        </a:effectStyle>
+        <a:effectStyle>
+          <a:effectLst>
+            <a:outerShdw blurRad="57150" dist="19050" dir="5400000" algn="ctr" rotWithShape="0">
+              <a:srgbClr val="000000">
+                <a:alpha val="63000"/>
+              </a:srgbClr>
+            </a:outerShdw>
+          </a:effectLst>
         </a:effectStyle>
       </a:effectStyleLst>
       <a:bgFillStyleLst>

</xml_diff>